<commit_message>
adding pages from medium
</commit_message>
<xml_diff>
--- a/Blogs.docx
+++ b/Blogs.docx
@@ -3,45 +3,6 @@
 <w:document xmlns:wpc="http://schemas.microsoft.com/office/word/2010/wordprocessingCanvas" xmlns:cx="http://schemas.microsoft.com/office/drawing/2014/chartex" xmlns:cx1="http://schemas.microsoft.com/office/drawing/2015/9/8/chartex" xmlns:cx2="http://schemas.microsoft.com/office/drawing/2015/10/21/chartex" xmlns:cx3="http://schemas.microsoft.com/office/drawing/2016/5/9/chartex" xmlns:cx4="http://schemas.microsoft.com/office/drawing/2016/5/10/chartex" xmlns:cx5="http://schemas.microsoft.com/office/drawing/2016/5/11/chartex" xmlns:cx6="http://schemas.microsoft.com/office/drawing/2016/5/12/chartex" xmlns:cx7="http://schemas.microsoft.com/office/drawing/2016/5/13/chartex" xmlns:cx8="http://schemas.microsoft.com/office/drawing/2016/5/14/chartex" xmlns:mc="http://schemas.openxmlformats.org/markup-compatibility/2006" xmlns:aink="http://schemas.microsoft.com/office/drawing/2016/ink" xmlns:am3d="http://schemas.microsoft.com/office/drawing/2017/model3d" xmlns:o="urn:schemas-microsoft-com:office:office" xmlns:oel="http://schemas.microsoft.com/office/2019/extlst" xmlns:r="http://schemas.openxmlformats.org/officeDocument/2006/relationships" xmlns:m="http://schemas.openxmlformats.org/officeDocument/2006/math" xmlns:v="urn:schemas-microsoft-com:vml" xmlns:wp14="http://schemas.microsoft.com/office/word/2010/wordprocessingDrawing" xmlns:wp="http://schemas.openxmlformats.org/drawingml/2006/wordprocessingDrawing" xmlns:w10="urn:schemas-microsoft-com:office:word" xmlns:w="http://schemas.openxmlformats.org/wordprocessingml/2006/main" xmlns:w14="http://schemas.microsoft.com/office/word/2010/wordml" xmlns:w15="http://schemas.microsoft.com/office/word/2012/wordml" xmlns:w16cex="http://schemas.microsoft.com/office/word/2018/wordml/cex" xmlns:w16cid="http://schemas.microsoft.com/office/word/2016/wordml/cid" xmlns:w16="http://schemas.microsoft.com/office/word/2018/wordml" xmlns:w16du="http://schemas.microsoft.com/office/word/2023/wordml/word16du" xmlns:w16sdtdh="http://schemas.microsoft.com/office/word/2020/wordml/sdtdatahash" xmlns:w16sdtfl="http://schemas.microsoft.com/office/word/2024/wordml/sdtformatlock" xmlns:w16se="http://schemas.microsoft.com/office/word/2015/wordml/symex" xmlns:wpg="http://schemas.microsoft.com/office/word/2010/wordprocessingGroup" xmlns:wpi="http://schemas.microsoft.com/office/word/2010/wordprocessingInk" xmlns:wne="http://schemas.microsoft.com/office/word/2006/wordml" xmlns:wps="http://schemas.microsoft.com/office/word/2010/wordprocessingShape" mc:Ignorable="w14 w15 w16se w16cid w16 w16cex w16sdtdh w16sdtfl w16du wp14">
   <w:body>
     <w:p>
-      <w:r>
-        <w:t>For your blog pages to appear in AI chats (like ChatGPT, Claude, Perplexity, or Gemini), they must be discovered, crawled, and understood by AI web-scrapers. Because GitHub Pages generates regular, public URLs, AI models can find them just like any other website. [</w:t>
-      </w:r>
-      <w:hyperlink r:id="rId5" w:history="1">
-        <w:r>
-          <w:rPr>
-            <w:rStyle w:val="Hyperlink"/>
-          </w:rPr>
-          <w:t>1</w:t>
-        </w:r>
-      </w:hyperlink>
-      <w:r>
-        <w:t xml:space="preserve">, </w:t>
-      </w:r>
-      <w:hyperlink r:id="rId6" w:history="1">
-        <w:r>
-          <w:rPr>
-            <w:rStyle w:val="Hyperlink"/>
-          </w:rPr>
-          <w:t>2</w:t>
-        </w:r>
-      </w:hyperlink>
-      <w:r>
-        <w:t>]</w:t>
-      </w:r>
-    </w:p>
-    <w:p>
-      <w:r>
-        <w:t>AI chats list blog pages through two distinct methods, using specific technical optimizations to improve visibility:</w:t>
-      </w:r>
-    </w:p>
-    <w:p>
-      <w:r>
-        <w:pict w14:anchorId="1DB396BE">
-          <v:rect id="_x0000_i1042" style="width:0;height:1.5pt" o:hralign="center" o:hrstd="t" o:hr="t" fillcolor="#a0a0a0" stroked="f"/>
-        </w:pict>
-      </w:r>
-    </w:p>
-    <w:p>
       <w:pPr>
         <w:rPr>
           <w:b/>
@@ -53,334 +14,355 @@
           <w:b/>
           <w:bCs/>
         </w:rPr>
-        <w:t>1. Real-Time AI Search (Live Browsing)</w:t>
+        <w:t>Enable/Disable delete confirmation windows 10</w:t>
       </w:r>
     </w:p>
     <w:p>
       <w:r>
-        <w:t xml:space="preserve">When a user asks an AI </w:t>
-      </w:r>
-      <w:proofErr w:type="gramStart"/>
-      <w:r>
-        <w:t>chat</w:t>
-      </w:r>
-      <w:proofErr w:type="gramEnd"/>
-      <w:r>
-        <w:t xml:space="preserve"> a question like </w:t>
-      </w:r>
-      <w:r>
-        <w:rPr>
-          <w:i/>
-          <w:iCs/>
-        </w:rPr>
-        <w:t>"What are the best tips for learning Git?"</w:t>
-      </w:r>
-      <w:r>
-        <w:t>, models with live browsing search the web in real time and summarize the top results. To ensure your blog pages are pulled into these answers: [</w:t>
-      </w:r>
-      <w:hyperlink r:id="rId7" w:history="1">
-        <w:r>
-          <w:rPr>
-            <w:rStyle w:val="Hyperlink"/>
-          </w:rPr>
-          <w:t>1</w:t>
-        </w:r>
-      </w:hyperlink>
-      <w:r>
-        <w:t>]</w:t>
+        <w:t>Delete confirmation dialog box is something which gives a chance to be sure before deleting any file or folder.</w:t>
       </w:r>
     </w:p>
     <w:p>
-      <w:pPr>
-        <w:numPr>
-          <w:ilvl w:val="0"/>
-          <w:numId w:val="18"/>
-        </w:numPr>
-      </w:pPr>
       <w:r>
-        <w:rPr>
-          <w:b/>
-          <w:bCs/>
-        </w:rPr>
-        <w:t>Get Indexed on Bing &amp; Google:</w:t>
-      </w:r>
-      <w:r>
-        <w:t xml:space="preserve"> Many AI tools do not run their own independent web index; instead, they use APIs from major search engines. If your GitHub Pages site is not indexed on </w:t>
+        <w:t xml:space="preserve">In </w:t>
       </w:r>
       <w:r>
         <w:rPr>
           <w:b/>
           <w:bCs/>
         </w:rPr>
-        <w:t>Google</w:t>
+        <w:t>Windows 8 and 10</w:t>
       </w:r>
       <w:r>
-        <w:t xml:space="preserve"> and </w:t>
+        <w:t xml:space="preserve"> by default this confirmation box got removed, so the user need to enable it manually. It is to be handy to have confirmation box if you by mistakenly press the delete button you loose that file ( you may recover it from recycle bin, but again that is a different story). I will always recommend having that confirmation dialog box with you.</w:t>
+      </w:r>
+    </w:p>
+    <w:p>
+      <w:r>
+        <w:t>Here I am sharing how you can enable or disable delete confirmation dialog box.</w:t>
+      </w:r>
+    </w:p>
+    <w:p>
+      <w:r>
+        <w:rPr>
+          <w:b/>
+          <w:bCs/>
+        </w:rPr>
+        <w:t>Step 1.</w:t>
+      </w:r>
+      <w:r>
+        <w:t xml:space="preserve"> Go to the desktop of your </w:t>
       </w:r>
       <w:r>
         <w:rPr>
           <w:b/>
           <w:bCs/>
         </w:rPr>
-        <w:t>Bing</w:t>
+        <w:t>Windows 8 or 10</w:t>
       </w:r>
       <w:r>
-        <w:t>, AI search assistants will not be able to find it. Submit your URL to Google Search Console and Bing Webmaster Tools. [</w:t>
-      </w:r>
-      <w:hyperlink r:id="rId8" w:history="1">
-        <w:r>
-          <w:rPr>
-            <w:rStyle w:val="Hyperlink"/>
-          </w:rPr>
-          <w:t>1</w:t>
-        </w:r>
-      </w:hyperlink>
-      <w:r>
-        <w:t>]</w:t>
+        <w:t xml:space="preserve"> machine.</w:t>
       </w:r>
     </w:p>
     <w:p>
-      <w:pPr>
-        <w:numPr>
-          <w:ilvl w:val="0"/>
-          <w:numId w:val="18"/>
-        </w:numPr>
-      </w:pPr>
+      <w:r>
+        <mc:AlternateContent>
+          <mc:Choice Requires="wps">
+            <w:drawing>
+              <wp:inline distT="0" distB="0" distL="0" distR="0" wp14:anchorId="54631E5D" wp14:editId="7B7E11EA">
+                <wp:extent cx="304800" cy="304800"/>
+                <wp:effectExtent l="0" t="0" r="0" b="0"/>
+                <wp:docPr id="867781520" name="Rectangle 8" descr="Become a Medium member">
+                  <a:hlinkClick xmlns:a="http://schemas.openxmlformats.org/drawingml/2006/main" r:id="rId5"/>
+                </wp:docPr>
+                <wp:cNvGraphicFramePr>
+                  <a:graphicFrameLocks xmlns:a="http://schemas.openxmlformats.org/drawingml/2006/main" noChangeAspect="1"/>
+                </wp:cNvGraphicFramePr>
+                <a:graphic xmlns:a="http://schemas.openxmlformats.org/drawingml/2006/main">
+                  <a:graphicData uri="http://schemas.microsoft.com/office/word/2010/wordprocessingShape">
+                    <wps:wsp>
+                      <wps:cNvSpPr>
+                        <a:spLocks noChangeAspect="1" noChangeArrowheads="1"/>
+                      </wps:cNvSpPr>
+                      <wps:spPr bwMode="auto">
+                        <a:xfrm>
+                          <a:off x="0" y="0"/>
+                          <a:ext cx="304800" cy="304800"/>
+                        </a:xfrm>
+                        <a:prstGeom prst="rect">
+                          <a:avLst/>
+                        </a:prstGeom>
+                        <a:noFill/>
+                        <a:ln>
+                          <a:noFill/>
+                        </a:ln>
+                        <a:extLst>
+                          <a:ext uri="{909E8E84-426E-40DD-AFC4-6F175D3DCCD1}">
+                            <a14:hiddenFill xmlns:a14="http://schemas.microsoft.com/office/drawing/2010/main">
+                              <a:solidFill>
+                                <a:srgbClr val="FFFFFF"/>
+                              </a:solidFill>
+                            </a14:hiddenFill>
+                          </a:ext>
+                          <a:ext uri="{91240B29-F687-4F45-9708-019B960494DF}">
+                            <a14:hiddenLine xmlns:a14="http://schemas.microsoft.com/office/drawing/2010/main" w="9525">
+                              <a:solidFill>
+                                <a:srgbClr val="000000"/>
+                              </a:solidFill>
+                              <a:miter lim="800000"/>
+                              <a:headEnd/>
+                              <a:tailEnd/>
+                            </a14:hiddenLine>
+                          </a:ext>
+                        </a:extLst>
+                      </wps:spPr>
+                      <wps:bodyPr rot="0" vert="horz" wrap="square" lIns="91440" tIns="45720" rIns="91440" bIns="45720" anchor="t" anchorCtr="0" upright="1">
+                        <a:noAutofit/>
+                      </wps:bodyPr>
+                    </wps:wsp>
+                  </a:graphicData>
+                </a:graphic>
+              </wp:inline>
+            </w:drawing>
+          </mc:Choice>
+          <mc:Fallback>
+            <w:pict>
+              <v:rect w14:anchorId="46CEBE17" id="Rectangle 8" o:spid="_x0000_s1026" alt="Become a Medium member" href="https://medium.com/plans?source=promotion_paragraph---post_body_banner_read_deeper--2f50f7fa6a32-----------------------------------------" style="width:24pt;height:24pt;visibility:visible;mso-wrap-style:square;mso-left-percent:-10001;mso-top-percent:-10001;mso-position-horizontal:absolute;mso-position-horizontal-relative:char;mso-position-vertical:absolute;mso-position-vertical-relative:line;mso-left-percent:-10001;mso-top-percent:-10001;v-text-anchor:top" o:gfxdata="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" o:button="t" filled="f" stroked="f">
+                <v:fill o:detectmouseclick="t"/>
+                <o:lock v:ext="edit" aspectratio="t"/>
+                <w10:anchorlock/>
+              </v:rect>
+            </w:pict>
+          </mc:Fallback>
+        </mc:AlternateContent>
+      </w:r>
+    </w:p>
+    <w:p>
       <w:r>
         <w:rPr>
           <w:b/>
           <w:bCs/>
         </w:rPr>
-        <w:t>Allow AI Bots in robots.txt:</w:t>
+        <w:t>Step 2.</w:t>
       </w:r>
       <w:r>
-        <w:t xml:space="preserve"> GitHub Pages allows web scrapers by default, but you must ensure you don't accidentally block them. Add a robots.txt file to the root of your repository and ensure it permits access to AI agents: [</w:t>
-      </w:r>
-      <w:hyperlink r:id="rId9" w:history="1">
-        <w:r>
-          <w:rPr>
-            <w:rStyle w:val="Hyperlink"/>
-          </w:rPr>
-          <w:t>1</w:t>
-        </w:r>
-      </w:hyperlink>
-      <w:r>
-        <w:t>]</w:t>
+        <w:t xml:space="preserve"> Search for shortcut icon of “Recycle Bin” and right click on it.</w:t>
       </w:r>
     </w:p>
     <w:p>
       <w:r>
-        <w:t>text</w:t>
+        <w:drawing>
+          <wp:inline distT="0" distB="0" distL="0" distR="0" wp14:anchorId="7990CB45" wp14:editId="58C3FFD9">
+            <wp:extent cx="5067300" cy="3746500"/>
+            <wp:effectExtent l="0" t="0" r="0" b="6350"/>
+            <wp:docPr id="719202346" name="Picture 7"/>
+            <wp:cNvGraphicFramePr>
+              <a:graphicFrameLocks xmlns:a="http://schemas.openxmlformats.org/drawingml/2006/main" noChangeAspect="1"/>
+            </wp:cNvGraphicFramePr>
+            <a:graphic xmlns:a="http://schemas.openxmlformats.org/drawingml/2006/main">
+              <a:graphicData uri="http://schemas.openxmlformats.org/drawingml/2006/picture">
+                <pic:pic xmlns:pic="http://schemas.openxmlformats.org/drawingml/2006/picture">
+                  <pic:nvPicPr>
+                    <pic:cNvPr id="0" name="Picture 51"/>
+                    <pic:cNvPicPr>
+                      <a:picLocks noChangeAspect="1" noChangeArrowheads="1"/>
+                    </pic:cNvPicPr>
+                  </pic:nvPicPr>
+                  <pic:blipFill>
+                    <a:blip r:embed="rId6">
+                      <a:extLst>
+                        <a:ext uri="{28A0092B-C50C-407E-A947-70E740481C1C}">
+                          <a14:useLocalDpi xmlns:a14="http://schemas.microsoft.com/office/drawing/2010/main" val="0"/>
+                        </a:ext>
+                      </a:extLst>
+                    </a:blip>
+                    <a:srcRect/>
+                    <a:stretch>
+                      <a:fillRect/>
+                    </a:stretch>
+                  </pic:blipFill>
+                  <pic:spPr bwMode="auto">
+                    <a:xfrm>
+                      <a:off x="0" y="0"/>
+                      <a:ext cx="5067300" cy="3746500"/>
+                    </a:xfrm>
+                    <a:prstGeom prst="rect">
+                      <a:avLst/>
+                    </a:prstGeom>
+                    <a:noFill/>
+                    <a:ln>
+                      <a:noFill/>
+                    </a:ln>
+                  </pic:spPr>
+                </pic:pic>
+              </a:graphicData>
+            </a:graphic>
+          </wp:inline>
+        </w:drawing>
       </w:r>
     </w:p>
     <w:p>
-      <w:r>
-        <w:t>User-agent: OAI-</w:t>
-      </w:r>
-      <w:proofErr w:type="spellStart"/>
-      <w:r>
-        <w:t>SearchBot</w:t>
-      </w:r>
-      <w:proofErr w:type="spellEnd"/>
-    </w:p>
-    <w:p>
-      <w:r>
-        <w:t>Allow: /</w:t>
-      </w:r>
-    </w:p>
-    <w:p/>
-    <w:p>
-      <w:r>
-        <w:t xml:space="preserve">User-agent: </w:t>
-      </w:r>
-      <w:proofErr w:type="spellStart"/>
-      <w:r>
-        <w:t>ClaudeBot</w:t>
-      </w:r>
-      <w:proofErr w:type="spellEnd"/>
-    </w:p>
-    <w:p>
-      <w:r>
-        <w:t>Allow: /</w:t>
-      </w:r>
-    </w:p>
-    <w:p>
-      <w:r>
-        <w:t>Use code with caution.</w:t>
-      </w:r>
-    </w:p>
-    <w:p>
-      <w:pPr>
-        <w:rPr>
-          <w:b/>
-          <w:bCs/>
-        </w:rPr>
-      </w:pPr>
       <w:r>
         <w:rPr>
           <w:b/>
           <w:bCs/>
         </w:rPr>
-        <w:t>2. Training Data (Future Knowledge Bases)</w:t>
+        <w:t>Step 3.</w:t>
+      </w:r>
+      <w:r>
+        <w:t xml:space="preserve"> Select the “Properties” from the menu. It will open up a popup.</w:t>
       </w:r>
     </w:p>
     <w:p>
       <w:r>
-        <w:t>AI companies periodically "scrape" massive portions of the public internet to train future versions of their language models.</w:t>
+        <w:lastRenderedPageBreak/>
+        <w:drawing>
+          <wp:inline distT="0" distB="0" distL="0" distR="0" wp14:anchorId="42D30F13" wp14:editId="509DCBE8">
+            <wp:extent cx="3892550" cy="4648200"/>
+            <wp:effectExtent l="0" t="0" r="0" b="0"/>
+            <wp:docPr id="616801464" name="Picture 6"/>
+            <wp:cNvGraphicFramePr>
+              <a:graphicFrameLocks xmlns:a="http://schemas.openxmlformats.org/drawingml/2006/main" noChangeAspect="1"/>
+            </wp:cNvGraphicFramePr>
+            <a:graphic xmlns:a="http://schemas.openxmlformats.org/drawingml/2006/main">
+              <a:graphicData uri="http://schemas.openxmlformats.org/drawingml/2006/picture">
+                <pic:pic xmlns:pic="http://schemas.openxmlformats.org/drawingml/2006/picture">
+                  <pic:nvPicPr>
+                    <pic:cNvPr id="0" name="Picture 52"/>
+                    <pic:cNvPicPr>
+                      <a:picLocks noChangeAspect="1" noChangeArrowheads="1"/>
+                    </pic:cNvPicPr>
+                  </pic:nvPicPr>
+                  <pic:blipFill>
+                    <a:blip r:embed="rId7">
+                      <a:extLst>
+                        <a:ext uri="{28A0092B-C50C-407E-A947-70E740481C1C}">
+                          <a14:useLocalDpi xmlns:a14="http://schemas.microsoft.com/office/drawing/2010/main" val="0"/>
+                        </a:ext>
+                      </a:extLst>
+                    </a:blip>
+                    <a:srcRect/>
+                    <a:stretch>
+                      <a:fillRect/>
+                    </a:stretch>
+                  </pic:blipFill>
+                  <pic:spPr bwMode="auto">
+                    <a:xfrm>
+                      <a:off x="0" y="0"/>
+                      <a:ext cx="3892550" cy="4648200"/>
+                    </a:xfrm>
+                    <a:prstGeom prst="rect">
+                      <a:avLst/>
+                    </a:prstGeom>
+                    <a:noFill/>
+                    <a:ln>
+                      <a:noFill/>
+                    </a:ln>
+                  </pic:spPr>
+                </pic:pic>
+              </a:graphicData>
+            </a:graphic>
+          </wp:inline>
+        </w:drawing>
       </w:r>
     </w:p>
     <w:p>
-      <w:pPr>
-        <w:numPr>
-          <w:ilvl w:val="0"/>
-          <w:numId w:val="19"/>
-        </w:numPr>
-      </w:pPr>
       <w:r>
-        <w:t xml:space="preserve">Because your GitHub Pages site is </w:t>
+        <w:rPr>
+          <w:b/>
+          <w:bCs/>
+        </w:rPr>
+        <w:t>Step 4.</w:t>
+      </w:r>
+      <w:r>
+        <w:t xml:space="preserve"> Now you can see the attribute “ </w:t>
       </w:r>
       <w:r>
         <w:rPr>
           <w:b/>
           <w:bCs/>
         </w:rPr>
-        <w:t>public HTML</w:t>
+        <w:t>Display delete confirmation dialog</w:t>
       </w:r>
       <w:r>
-        <w:t xml:space="preserve">, standard web crawlers (like </w:t>
-      </w:r>
-      <w:proofErr w:type="spellStart"/>
-      <w:r>
-        <w:t>GPTBot</w:t>
-      </w:r>
-      <w:proofErr w:type="spellEnd"/>
-      <w:r>
-        <w:t xml:space="preserve"> or </w:t>
-      </w:r>
-      <w:proofErr w:type="spellStart"/>
-      <w:r>
-        <w:t>PerplexityBot</w:t>
-      </w:r>
-      <w:proofErr w:type="spellEnd"/>
-      <w:r>
-        <w:t>) will scan your text and ingest it into their massive datasets. [</w:t>
-      </w:r>
-      <w:hyperlink r:id="rId10" w:history="1">
-        <w:r>
-          <w:rPr>
-            <w:rStyle w:val="Hyperlink"/>
-          </w:rPr>
-          <w:t>1</w:t>
-        </w:r>
-      </w:hyperlink>
-      <w:r>
-        <w:t xml:space="preserve">, </w:t>
-      </w:r>
-      <w:hyperlink r:id="rId11" w:history="1">
-        <w:r>
-          <w:rPr>
-            <w:rStyle w:val="Hyperlink"/>
-          </w:rPr>
-          <w:t>2</w:t>
-        </w:r>
-      </w:hyperlink>
-      <w:r>
-        <w:t>]</w:t>
+        <w:t>”, you can enable or disable by clicking checkbox in front of it.</w:t>
       </w:r>
     </w:p>
     <w:p>
-      <w:pPr>
-        <w:numPr>
-          <w:ilvl w:val="0"/>
-          <w:numId w:val="19"/>
-        </w:numPr>
-      </w:pPr>
-      <w:r>
-        <w:lastRenderedPageBreak/>
-        <w:t>Once trained on your content, the AI might answer a user's question using information it learned from your blog, even without doing a live web search.</w:t>
-      </w:r>
-    </w:p>
-    <w:p>
-      <w:r>
-        <w:pict w14:anchorId="0DAAC27B">
-          <v:rect id="_x0000_i1043" style="width:0;height:1.5pt" o:hralign="center" o:hrstd="t" o:hr="t" fillcolor="#a0a0a0" stroked="f"/>
-        </w:pict>
-      </w:r>
-    </w:p>
-    <w:p>
-      <w:pPr>
-        <w:rPr>
-          <w:b/>
-          <w:bCs/>
-        </w:rPr>
-      </w:pPr>
       <w:r>
         <w:rPr>
           <w:b/>
           <w:bCs/>
         </w:rPr>
-        <w:t>How to Optimize Your Blog for AI Models</w:t>
+        <w:t>Step 5.</w:t>
+      </w:r>
+      <w:r>
+        <w:t xml:space="preserve"> Just check that attribute and click “Apply” button to affect the changes in system.</w:t>
       </w:r>
     </w:p>
     <w:p>
       <w:r>
-        <w:t>To make it as easy as possible for AI bots to read, summarize, and cite your GitHub Pages blog, implement these best practices:</w:t>
+        <w:t>Now if you try to delete any file you will get the delete confirmation box as below:</w:t>
       </w:r>
     </w:p>
     <w:p>
-      <w:pPr>
-        <w:numPr>
-          <w:ilvl w:val="0"/>
-          <w:numId w:val="20"/>
-        </w:numPr>
-      </w:pPr>
       <w:r>
-        <w:rPr>
-          <w:b/>
-          <w:bCs/>
-        </w:rPr>
-        <w:t>Create an llms.txt File:</w:t>
-      </w:r>
-      <w:r>
-        <w:t xml:space="preserve"> This is a modern web standard specifically for AI. Create a file named llms.txt in the root folder of your GitHub repo. Write a clean, markdown-formatted summary of what your blog is about and list your most important articles. AI bots look for this file to quickly digest a site without scanning every single page.</w:t>
+        <w:drawing>
+          <wp:inline distT="0" distB="0" distL="0" distR="0" wp14:anchorId="35F6333B" wp14:editId="72D273F3">
+            <wp:extent cx="5276850" cy="2305050"/>
+            <wp:effectExtent l="0" t="0" r="0" b="0"/>
+            <wp:docPr id="214410040" name="Picture 5"/>
+            <wp:cNvGraphicFramePr>
+              <a:graphicFrameLocks xmlns:a="http://schemas.openxmlformats.org/drawingml/2006/main" noChangeAspect="1"/>
+            </wp:cNvGraphicFramePr>
+            <a:graphic xmlns:a="http://schemas.openxmlformats.org/drawingml/2006/main">
+              <a:graphicData uri="http://schemas.openxmlformats.org/drawingml/2006/picture">
+                <pic:pic xmlns:pic="http://schemas.openxmlformats.org/drawingml/2006/picture">
+                  <pic:nvPicPr>
+                    <pic:cNvPr id="0" name="Picture 53"/>
+                    <pic:cNvPicPr>
+                      <a:picLocks noChangeAspect="1" noChangeArrowheads="1"/>
+                    </pic:cNvPicPr>
+                  </pic:nvPicPr>
+                  <pic:blipFill>
+                    <a:blip r:embed="rId8">
+                      <a:extLst>
+                        <a:ext uri="{28A0092B-C50C-407E-A947-70E740481C1C}">
+                          <a14:useLocalDpi xmlns:a14="http://schemas.microsoft.com/office/drawing/2010/main" val="0"/>
+                        </a:ext>
+                      </a:extLst>
+                    </a:blip>
+                    <a:srcRect/>
+                    <a:stretch>
+                      <a:fillRect/>
+                    </a:stretch>
+                  </pic:blipFill>
+                  <pic:spPr bwMode="auto">
+                    <a:xfrm>
+                      <a:off x="0" y="0"/>
+                      <a:ext cx="5276850" cy="2305050"/>
+                    </a:xfrm>
+                    <a:prstGeom prst="rect">
+                      <a:avLst/>
+                    </a:prstGeom>
+                    <a:noFill/>
+                    <a:ln>
+                      <a:noFill/>
+                    </a:ln>
+                  </pic:spPr>
+                </pic:pic>
+              </a:graphicData>
+            </a:graphic>
+          </wp:inline>
+        </w:drawing>
       </w:r>
     </w:p>
     <w:p>
-      <w:pPr>
-        <w:numPr>
-          <w:ilvl w:val="0"/>
-          <w:numId w:val="20"/>
-        </w:numPr>
-      </w:pPr>
       <w:r>
-        <w:rPr>
-          <w:b/>
-          <w:bCs/>
-        </w:rPr>
-        <w:t>Use Clear Markdown Headings:</w:t>
-      </w:r>
-      <w:r>
-        <w:t xml:space="preserve"> Static site generators (like Jekyll or Hugo) convert your Markdown headings (#, ##, ###) into clean HTML tags (&lt;h1&gt;, &lt;h2&gt;). AI models rely heavily on semantic HTML structures to understand the layout and key takeaways of your articles.</w:t>
+        <w:t>That its!!</w:t>
       </w:r>
     </w:p>
-    <w:p>
-      <w:pPr>
-        <w:numPr>
-          <w:ilvl w:val="0"/>
-          <w:numId w:val="20"/>
-        </w:numPr>
-      </w:pPr>
-      <w:r>
-        <w:rPr>
-          <w:b/>
-          <w:bCs/>
-        </w:rPr>
-        <w:t>Provide Direct Answers:</w:t>
-      </w:r>
-      <w:r>
-        <w:t xml:space="preserve"> AI search bots look for concise, direct answers to summarize for the user. Structuring your blog posts with an "Answer-First" approach (putting the direct conclusion in the first few sentences of a section) makes it highly extractable for chatbots.</w:t>
-      </w:r>
-    </w:p>
+    <w:p/>
     <w:sectPr>
       <w:pgSz w:w="11906" w:h="16838"/>
       <w:pgMar w:top="1440" w:right="1440" w:bottom="1440" w:left="1440" w:header="708" w:footer="708" w:gutter="0"/>

</xml_diff>